<commit_message>
Update game symbols and documentation for clarity; enhance test cases with symbol mapping
</commit_message>
<xml_diff>
--- a/docs/T1_BuscaCompetitiva_Damas.docx
+++ b/docs/T1_BuscaCompetitiva_Damas.docx
@@ -224,7 +224,7 @@
           <w:bCs w:val="0"/>
         </w:rPr>
         <w:alias w:val="Sumário"/>
-        <w:id w:val="-1822646578"/>
+        <w:id w:val="-1147973793"/>
       </w:sdtPr>
       <w:sdtEndPr/>
       <w:sdtContent>
@@ -252,7 +252,7 @@
           <w:r>
             <w:fldChar w:fldCharType="separate"/>
           </w:r>
-          <w:hyperlink w:anchor="_Toc243678718" w:history="1">
+          <w:hyperlink w:anchor="_Toc243689198" w:history="1">
             <w:r>
               <w:rPr>
                 <w:rStyle w:val="Hyperlink"/>
@@ -276,7 +276,7 @@
               <w:rPr>
                 <w:noProof/>
               </w:rPr>
-              <w:instrText xml:space="preserve"> PAGEREF _Toc243678718 \h </w:instrText>
+              <w:instrText xml:space="preserve"> PAGEREF _Toc243689198 \h </w:instrText>
             </w:r>
             <w:r>
               <w:rPr>
@@ -316,7 +316,7 @@
               <w14:ligatures w14:val="standardContextual"/>
             </w:rPr>
           </w:pPr>
-          <w:hyperlink w:anchor="_Toc243678719" w:history="1">
+          <w:hyperlink w:anchor="_Toc243689199" w:history="1">
             <w:r>
               <w:rPr>
                 <w:rStyle w:val="Hyperlink"/>
@@ -340,7 +340,7 @@
               <w:rPr>
                 <w:noProof/>
               </w:rPr>
-              <w:instrText xml:space="preserve"> PAGEREF _Toc243678719 \h </w:instrText>
+              <w:instrText xml:space="preserve"> PAGEREF _Toc243689199 \h </w:instrText>
             </w:r>
             <w:r>
               <w:rPr>
@@ -382,7 +382,7 @@
               <w14:ligatures w14:val="standardContextual"/>
             </w:rPr>
           </w:pPr>
-          <w:hyperlink w:anchor="_Toc243678720" w:history="1">
+          <w:hyperlink w:anchor="_Toc243689200" w:history="1">
             <w:r>
               <w:rPr>
                 <w:rStyle w:val="Hyperlink"/>
@@ -406,7 +406,7 @@
               <w:rPr>
                 <w:noProof/>
               </w:rPr>
-              <w:instrText xml:space="preserve"> PAGEREF _Toc243678720 \h </w:instrText>
+              <w:instrText xml:space="preserve"> PAGEREF _Toc243689200 \h </w:instrText>
             </w:r>
             <w:r>
               <w:rPr>
@@ -448,7 +448,7 @@
               <w14:ligatures w14:val="standardContextual"/>
             </w:rPr>
           </w:pPr>
-          <w:hyperlink w:anchor="_Toc243678721" w:history="1">
+          <w:hyperlink w:anchor="_Toc243689201" w:history="1">
             <w:r>
               <w:rPr>
                 <w:rStyle w:val="Hyperlink"/>
@@ -472,7 +472,7 @@
               <w:rPr>
                 <w:noProof/>
               </w:rPr>
-              <w:instrText xml:space="preserve"> PAGEREF _Toc243678721 \h </w:instrText>
+              <w:instrText xml:space="preserve"> PAGEREF _Toc243689201 \h </w:instrText>
             </w:r>
             <w:r>
               <w:rPr>
@@ -514,7 +514,7 @@
               <w14:ligatures w14:val="standardContextual"/>
             </w:rPr>
           </w:pPr>
-          <w:hyperlink w:anchor="_Toc243678722" w:history="1">
+          <w:hyperlink w:anchor="_Toc243689202" w:history="1">
             <w:r>
               <w:rPr>
                 <w:rStyle w:val="Hyperlink"/>
@@ -538,7 +538,7 @@
               <w:rPr>
                 <w:noProof/>
               </w:rPr>
-              <w:instrText xml:space="preserve"> PAGEREF _Toc243678722 \h </w:instrText>
+              <w:instrText xml:space="preserve"> PAGEREF _Toc243689202 \h </w:instrText>
             </w:r>
             <w:r>
               <w:rPr>
@@ -578,7 +578,7 @@
               <w14:ligatures w14:val="standardContextual"/>
             </w:rPr>
           </w:pPr>
-          <w:hyperlink w:anchor="_Toc243678723" w:history="1">
+          <w:hyperlink w:anchor="_Toc243689203" w:history="1">
             <w:r>
               <w:rPr>
                 <w:rStyle w:val="Hyperlink"/>
@@ -602,7 +602,7 @@
               <w:rPr>
                 <w:noProof/>
               </w:rPr>
-              <w:instrText xml:space="preserve"> PAGEREF _Toc243678723 \h </w:instrText>
+              <w:instrText xml:space="preserve"> PAGEREF _Toc243689203 \h </w:instrText>
             </w:r>
             <w:r>
               <w:rPr>
@@ -642,7 +642,7 @@
               <w14:ligatures w14:val="standardContextual"/>
             </w:rPr>
           </w:pPr>
-          <w:hyperlink w:anchor="_Toc243678724" w:history="1">
+          <w:hyperlink w:anchor="_Toc243689204" w:history="1">
             <w:r>
               <w:rPr>
                 <w:rStyle w:val="Hyperlink"/>
@@ -666,7 +666,7 @@
               <w:rPr>
                 <w:noProof/>
               </w:rPr>
-              <w:instrText xml:space="preserve"> PAGEREF _Toc243678724 \h </w:instrText>
+              <w:instrText xml:space="preserve"> PAGEREF _Toc243689204 \h </w:instrText>
             </w:r>
             <w:r>
               <w:rPr>
@@ -706,7 +706,7 @@
               <w14:ligatures w14:val="standardContextual"/>
             </w:rPr>
           </w:pPr>
-          <w:hyperlink w:anchor="_Toc243678725" w:history="1">
+          <w:hyperlink w:anchor="_Toc243689205" w:history="1">
             <w:r>
               <w:rPr>
                 <w:rStyle w:val="Hyperlink"/>
@@ -730,7 +730,7 @@
               <w:rPr>
                 <w:noProof/>
               </w:rPr>
-              <w:instrText xml:space="preserve"> PAGEREF _Toc243678725 \h </w:instrText>
+              <w:instrText xml:space="preserve"> PAGEREF _Toc243689205 \h </w:instrText>
             </w:r>
             <w:r>
               <w:rPr>
@@ -770,7 +770,7 @@
               <w14:ligatures w14:val="standardContextual"/>
             </w:rPr>
           </w:pPr>
-          <w:hyperlink w:anchor="_Toc243678726" w:history="1">
+          <w:hyperlink w:anchor="_Toc243689206" w:history="1">
             <w:r>
               <w:rPr>
                 <w:rStyle w:val="Hyperlink"/>
@@ -794,7 +794,7 @@
               <w:rPr>
                 <w:noProof/>
               </w:rPr>
-              <w:instrText xml:space="preserve"> PAGEREF _Toc243678726 \h </w:instrText>
+              <w:instrText xml:space="preserve"> PAGEREF _Toc243689206 \h </w:instrText>
             </w:r>
             <w:r>
               <w:rPr>
@@ -836,7 +836,7 @@
               <w14:ligatures w14:val="standardContextual"/>
             </w:rPr>
           </w:pPr>
-          <w:hyperlink w:anchor="_Toc243678727" w:history="1">
+          <w:hyperlink w:anchor="_Toc243689207" w:history="1">
             <w:r>
               <w:rPr>
                 <w:rStyle w:val="Hyperlink"/>
@@ -860,7 +860,7 @@
               <w:rPr>
                 <w:noProof/>
               </w:rPr>
-              <w:instrText xml:space="preserve"> PAGEREF _Toc243678727 \h </w:instrText>
+              <w:instrText xml:space="preserve"> PAGEREF _Toc243689207 \h </w:instrText>
             </w:r>
             <w:r>
               <w:rPr>
@@ -902,7 +902,7 @@
               <w14:ligatures w14:val="standardContextual"/>
             </w:rPr>
           </w:pPr>
-          <w:hyperlink w:anchor="_Toc243678728" w:history="1">
+          <w:hyperlink w:anchor="_Toc243689208" w:history="1">
             <w:r>
               <w:rPr>
                 <w:rStyle w:val="Hyperlink"/>
@@ -926,7 +926,7 @@
               <w:rPr>
                 <w:noProof/>
               </w:rPr>
-              <w:instrText xml:space="preserve"> PAGEREF _Toc243678728 \h </w:instrText>
+              <w:instrText xml:space="preserve"> PAGEREF _Toc243689208 \h </w:instrText>
             </w:r>
             <w:r>
               <w:rPr>
@@ -968,7 +968,7 @@
               <w14:ligatures w14:val="standardContextual"/>
             </w:rPr>
           </w:pPr>
-          <w:hyperlink w:anchor="_Toc243678729" w:history="1">
+          <w:hyperlink w:anchor="_Toc243689209" w:history="1">
             <w:r>
               <w:rPr>
                 <w:rStyle w:val="Hyperlink"/>
@@ -992,7 +992,7 @@
               <w:rPr>
                 <w:noProof/>
               </w:rPr>
-              <w:instrText xml:space="preserve"> PAGEREF _Toc243678729 \h </w:instrText>
+              <w:instrText xml:space="preserve"> PAGEREF _Toc243689209 \h </w:instrText>
             </w:r>
             <w:r>
               <w:rPr>
@@ -1034,7 +1034,7 @@
               <w14:ligatures w14:val="standardContextual"/>
             </w:rPr>
           </w:pPr>
-          <w:hyperlink w:anchor="_Toc243678730" w:history="1">
+          <w:hyperlink w:anchor="_Toc243689210" w:history="1">
             <w:r>
               <w:rPr>
                 <w:rStyle w:val="Hyperlink"/>
@@ -1058,7 +1058,7 @@
               <w:rPr>
                 <w:noProof/>
               </w:rPr>
-              <w:instrText xml:space="preserve"> PAGEREF _Toc243678730 \h </w:instrText>
+              <w:instrText xml:space="preserve"> PAGEREF _Toc243689210 \h </w:instrText>
             </w:r>
             <w:r>
               <w:rPr>
@@ -1110,7 +1110,7 @@
         <w:pageBreakBefore/>
         <w:spacing w:after="360"/>
       </w:pPr>
-      <w:bookmarkStart w:id="0" w:name="_Toc243678718"/>
+      <w:bookmarkStart w:id="0" w:name="_Toc243689198"/>
       <w:r>
         <w:t>1 O JOGO ESCOLHIDO: DAMAS</w:t>
       </w:r>
@@ -1141,7 +1141,7 @@
         <w:keepNext/>
         <w:spacing w:before="360" w:after="360"/>
       </w:pPr>
-      <w:bookmarkStart w:id="1" w:name="_Toc243678719"/>
+      <w:bookmarkStart w:id="1" w:name="_Toc243689199"/>
       <w:r>
         <w:t>1.1 Regras</w:t>
       </w:r>
@@ -1348,7 +1348,7 @@
         <w:pageBreakBefore/>
         <w:spacing w:after="360"/>
       </w:pPr>
-      <w:bookmarkStart w:id="2" w:name="_Toc243678720"/>
+      <w:bookmarkStart w:id="2" w:name="_Toc243689200"/>
       <w:r>
         <w:t>2 FORMULAÇÃO DO PROBLEMA DE BUSCA</w:t>
       </w:r>
@@ -1539,7 +1539,7 @@
                 <w:sz w:val="20"/>
                 <w:szCs w:val="20"/>
               </w:rPr>
-              <w:t>Tabuleiro 8×8 (cada casa vazia ou com b, p, B ou P), de quem é a vez e o contador de lances seguidos só de damas sem captura, usado na regra de empate.</w:t>
+              <w:t>Tabuleiro 8×8 (cada casa vazia ou com um peão ou uma dama de cada cor), de quem é a vez e o contador de lances seguidos só de damas sem captura, usado na regra de empate.</w:t>
             </w:r>
           </w:p>
         </w:tc>
@@ -1971,7 +1971,7 @@
         <w:pageBreakBefore/>
         <w:spacing w:after="360"/>
       </w:pPr>
-      <w:bookmarkStart w:id="3" w:name="_Toc243678721"/>
+      <w:bookmarkStart w:id="3" w:name="_Toc243689201"/>
       <w:r>
         <w:t>3 TIPO DE JOGO: DETERMINÍSTICO</w:t>
       </w:r>
@@ -2091,7 +2091,7 @@
         <w:pageBreakBefore/>
         <w:spacing w:after="360"/>
       </w:pPr>
-      <w:bookmarkStart w:id="4" w:name="_Toc243678722"/>
+      <w:bookmarkStart w:id="4" w:name="_Toc243689202"/>
       <w:r>
         <w:t>4 ALGORITMO ESCOLHIDO: MINIMAX COM PODA ALFA-BETA</w:t>
       </w:r>
@@ -2103,7 +2103,7 @@
         <w:keepNext/>
         <w:spacing w:before="360" w:after="360"/>
       </w:pPr>
-      <w:bookmarkStart w:id="5" w:name="_Toc243678723"/>
+      <w:bookmarkStart w:id="5" w:name="_Toc243689203"/>
       <w:r>
         <w:t>4.1 Por que este algoritmo</w:t>
       </w:r>
@@ -2225,7 +2225,7 @@
         <w:keepNext/>
         <w:spacing w:before="360" w:after="360"/>
       </w:pPr>
-      <w:bookmarkStart w:id="6" w:name="_Toc243678724"/>
+      <w:bookmarkStart w:id="6" w:name="_Toc243689204"/>
       <w:r>
         <w:t>4.2 Função heurística (avaliação de estados não terminais)</w:t>
       </w:r>
@@ -2618,7 +2618,7 @@
         <w:keepNext/>
         <w:spacing w:before="360" w:after="360"/>
       </w:pPr>
-      <w:bookmarkStart w:id="7" w:name="_Toc243678725"/>
+      <w:bookmarkStart w:id="7" w:name="_Toc243689205"/>
       <w:r>
         <w:t>4.3 Pseudocódigo</w:t>
       </w:r>
@@ -2950,7 +2950,7 @@
         <w:keepNext/>
         <w:spacing w:before="360" w:after="360"/>
       </w:pPr>
-      <w:bookmarkStart w:id="8" w:name="_Toc243678726"/>
+      <w:bookmarkStart w:id="8" w:name="_Toc243689206"/>
       <w:r>
         <w:t>4.4 Resultado medido: efeito da poda</w:t>
       </w:r>
@@ -3795,7 +3795,7 @@
         <w:pageBreakBefore/>
         <w:spacing w:after="360"/>
       </w:pPr>
-      <w:bookmarkStart w:id="9" w:name="_Toc243678727"/>
+      <w:bookmarkStart w:id="9" w:name="_Toc243689207"/>
       <w:r>
         <w:t>5 IMPLEMENTAÇÃO EM PYTHON</w:t>
       </w:r>
@@ -4414,7 +4414,7 @@
         <w:pageBreakBefore/>
         <w:spacing w:after="360"/>
       </w:pPr>
-      <w:bookmarkStart w:id="10" w:name="_Toc243678728"/>
+      <w:bookmarkStart w:id="10" w:name="_Toc243689208"/>
       <w:r>
         <w:t>6 REFLEXÃO: FOI O ALGORITMO MAIS INDICADO?</w:t>
       </w:r>
@@ -4583,7 +4583,7 @@
         <w:pageBreakBefore/>
         <w:spacing w:after="360"/>
       </w:pPr>
-      <w:bookmarkStart w:id="11" w:name="_Toc243678729"/>
+      <w:bookmarkStart w:id="11" w:name="_Toc243689209"/>
       <w:r>
         <w:t>7 ORGANIZAÇÃO DO GRUPO</w:t>
       </w:r>
@@ -5385,7 +5385,7 @@
         <w:spacing w:after="360"/>
         <w:jc w:val="center"/>
       </w:pPr>
-      <w:bookmarkStart w:id="12" w:name="_Toc243678730"/>
+      <w:bookmarkStart w:id="12" w:name="_Toc243689210"/>
       <w:r>
         <w:t>REFERÊNCIAS</w:t>
       </w:r>
@@ -5576,10 +5576,10 @@
 <file path=word/numbering.xml><?xml version="1.0" encoding="utf-8"?>
 <w:numbering xmlns:wpc="http://schemas.microsoft.com/office/word/2010/wordprocessingCanvas" xmlns:cx="http://schemas.microsoft.com/office/drawing/2014/chartex" xmlns:cx1="http://schemas.microsoft.com/office/drawing/2015/9/8/chartex" xmlns:cx2="http://schemas.microsoft.com/office/drawing/2015/10/21/chartex" xmlns:cx3="http://schemas.microsoft.com/office/drawing/2016/5/9/chartex" xmlns:cx4="http://schemas.microsoft.com/office/drawing/2016/5/10/chartex" xmlns:cx5="http://schemas.microsoft.com/office/drawing/2016/5/11/chartex" xmlns:cx6="http://schemas.microsoft.com/office/drawing/2016/5/12/chartex" xmlns:cx7="http://schemas.microsoft.com/office/drawing/2016/5/13/chartex" xmlns:cx8="http://schemas.microsoft.com/office/drawing/2016/5/14/chartex" xmlns:mc="http://schemas.openxmlformats.org/markup-compatibility/2006" xmlns:aink="http://schemas.microsoft.com/office/drawing/2016/ink" xmlns:am3d="http://schemas.microsoft.com/office/drawing/2017/model3d" xmlns:o="urn:schemas-microsoft-com:office:office" xmlns:oel="http://schemas.microsoft.com/office/2019/extlst" xmlns:r="http://schemas.openxmlformats.org/officeDocument/2006/relationships" xmlns:m="http://schemas.openxmlformats.org/officeDocument/2006/math" xmlns:v="urn:schemas-microsoft-com:vml" xmlns:wp14="http://schemas.microsoft.com/office/word/2010/wordprocessingDrawing" xmlns:wp="http://schemas.openxmlformats.org/drawingml/2006/wordprocessingDrawing" xmlns:w10="urn:schemas-microsoft-com:office:word" xmlns:w="http://schemas.openxmlformats.org/wordprocessingml/2006/main" xmlns:w14="http://schemas.microsoft.com/office/word/2010/wordml" xmlns:w15="http://schemas.microsoft.com/office/word/2012/wordml" xmlns:w16cex="http://schemas.microsoft.com/office/word/2018/wordml/cex" xmlns:w16cid="http://schemas.microsoft.com/office/word/2016/wordml/cid" xmlns:w16="http://schemas.microsoft.com/office/word/2018/wordml" xmlns:w16du="http://schemas.microsoft.com/office/word/2023/wordml/word16du" xmlns:w16sdtdh="http://schemas.microsoft.com/office/word/2020/wordml/sdtdatahash" xmlns:w16sdtfl="http://schemas.microsoft.com/office/word/2024/wordml/sdtformatlock" xmlns:w16se="http://schemas.microsoft.com/office/word/2015/wordml/symex" xmlns:wpg="http://schemas.microsoft.com/office/word/2010/wordprocessingGroup" xmlns:wpi="http://schemas.microsoft.com/office/word/2010/wordprocessingInk" xmlns:wne="http://schemas.microsoft.com/office/word/2006/wordml" xmlns:wps="http://schemas.microsoft.com/office/word/2010/wordprocessingShape" mc:Ignorable="w14 w15 w16se w16cid w16 w16cex w16sdtdh w16sdtfl w16du wp14">
   <w:abstractNum w:abstractNumId="0" w15:restartNumberingAfterBreak="0">
-    <w:nsid w:val="424C1612"/>
+    <w:nsid w:val="10374991"/>
     <w:multiLevelType w:val="hybridMultilevel"/>
-    <w:tmpl w:val="EC065994"/>
-    <w:lvl w:ilvl="0" w:tplc="0720A9E4">
+    <w:tmpl w:val="FD6CD8B6"/>
+    <w:lvl w:ilvl="0" w:tplc="5E2C2F90">
       <w:start w:val="1"/>
       <w:numFmt w:val="lowerLetter"/>
       <w:lvlText w:val="%1)"/>
@@ -5588,52 +5588,138 @@
         <w:ind w:left="1069" w:hanging="360"/>
       </w:pPr>
     </w:lvl>
-    <w:lvl w:ilvl="1" w:tplc="0BDEB520">
+    <w:lvl w:ilvl="1" w:tplc="1CD681F0">
       <w:numFmt w:val="decimal"/>
       <w:lvlText w:val=""/>
       <w:lvlJc w:val="left"/>
     </w:lvl>
-    <w:lvl w:ilvl="2" w:tplc="1C4278A8">
+    <w:lvl w:ilvl="2" w:tplc="6D50EDE4">
       <w:numFmt w:val="decimal"/>
       <w:lvlText w:val=""/>
       <w:lvlJc w:val="left"/>
     </w:lvl>
-    <w:lvl w:ilvl="3" w:tplc="604CA926">
+    <w:lvl w:ilvl="3" w:tplc="D8F0E6C8">
       <w:numFmt w:val="decimal"/>
       <w:lvlText w:val=""/>
       <w:lvlJc w:val="left"/>
     </w:lvl>
-    <w:lvl w:ilvl="4" w:tplc="A3C44278">
+    <w:lvl w:ilvl="4" w:tplc="2AEC2B76">
       <w:numFmt w:val="decimal"/>
       <w:lvlText w:val=""/>
       <w:lvlJc w:val="left"/>
     </w:lvl>
-    <w:lvl w:ilvl="5" w:tplc="58DC62D4">
+    <w:lvl w:ilvl="5" w:tplc="CB14491A">
       <w:numFmt w:val="decimal"/>
       <w:lvlText w:val=""/>
       <w:lvlJc w:val="left"/>
     </w:lvl>
-    <w:lvl w:ilvl="6" w:tplc="F63C0F10">
+    <w:lvl w:ilvl="6" w:tplc="B9441B44">
       <w:numFmt w:val="decimal"/>
       <w:lvlText w:val=""/>
       <w:lvlJc w:val="left"/>
     </w:lvl>
-    <w:lvl w:ilvl="7" w:tplc="4492F9EA">
+    <w:lvl w:ilvl="7" w:tplc="87FE8344">
       <w:numFmt w:val="decimal"/>
       <w:lvlText w:val=""/>
       <w:lvlJc w:val="left"/>
     </w:lvl>
-    <w:lvl w:ilvl="8" w:tplc="4FC48BFC">
+    <w:lvl w:ilvl="8" w:tplc="55A0457C">
       <w:numFmt w:val="decimal"/>
       <w:lvlText w:val=""/>
       <w:lvlJc w:val="left"/>
     </w:lvl>
   </w:abstractNum>
   <w:abstractNum w:abstractNumId="1" w15:restartNumberingAfterBreak="0">
-    <w:nsid w:val="477E74E2"/>
+    <w:nsid w:val="1A3403F4"/>
     <w:multiLevelType w:val="hybridMultilevel"/>
-    <w:tmpl w:val="B6EC2158"/>
-    <w:lvl w:ilvl="0" w:tplc="801E9AE4">
+    <w:tmpl w:val="89FE4CF6"/>
+    <w:lvl w:ilvl="0" w:tplc="FA1E1CD0" w:tentative="1">
+      <w:start w:val="1"/>
+      <w:numFmt w:val="bullet"/>
+      <w:lvlText w:val="●"/>
+      <w:lvlJc w:val="left"/>
+      <w:pPr>
+        <w:ind w:left="720" w:hanging="360"/>
+      </w:pPr>
+    </w:lvl>
+    <w:lvl w:ilvl="1" w:tplc="C5DACB82" w:tentative="1">
+      <w:start w:val="1"/>
+      <w:numFmt w:val="bullet"/>
+      <w:lvlText w:val="○"/>
+      <w:lvlJc w:val="left"/>
+      <w:pPr>
+        <w:ind w:left="1440" w:hanging="360"/>
+      </w:pPr>
+    </w:lvl>
+    <w:lvl w:ilvl="2" w:tplc="D00A8E2C" w:tentative="1">
+      <w:start w:val="1"/>
+      <w:numFmt w:val="bullet"/>
+      <w:lvlText w:val="■"/>
+      <w:lvlJc w:val="left"/>
+      <w:pPr>
+        <w:ind w:left="2160" w:hanging="360"/>
+      </w:pPr>
+    </w:lvl>
+    <w:lvl w:ilvl="3" w:tplc="8F68EBBC" w:tentative="1">
+      <w:start w:val="1"/>
+      <w:numFmt w:val="bullet"/>
+      <w:lvlText w:val="●"/>
+      <w:lvlJc w:val="left"/>
+      <w:pPr>
+        <w:ind w:left="2880" w:hanging="360"/>
+      </w:pPr>
+    </w:lvl>
+    <w:lvl w:ilvl="4" w:tplc="316414DE" w:tentative="1">
+      <w:start w:val="1"/>
+      <w:numFmt w:val="bullet"/>
+      <w:lvlText w:val="○"/>
+      <w:lvlJc w:val="left"/>
+      <w:pPr>
+        <w:ind w:left="3600" w:hanging="360"/>
+      </w:pPr>
+    </w:lvl>
+    <w:lvl w:ilvl="5" w:tplc="D102AECE" w:tentative="1">
+      <w:start w:val="1"/>
+      <w:numFmt w:val="bullet"/>
+      <w:lvlText w:val="■"/>
+      <w:lvlJc w:val="left"/>
+      <w:pPr>
+        <w:ind w:left="4320" w:hanging="360"/>
+      </w:pPr>
+    </w:lvl>
+    <w:lvl w:ilvl="6" w:tplc="91840D02" w:tentative="1">
+      <w:start w:val="1"/>
+      <w:numFmt w:val="bullet"/>
+      <w:lvlText w:val="●"/>
+      <w:lvlJc w:val="left"/>
+      <w:pPr>
+        <w:ind w:left="5040" w:hanging="360"/>
+      </w:pPr>
+    </w:lvl>
+    <w:lvl w:ilvl="7" w:tplc="804EA348" w:tentative="1">
+      <w:start w:val="1"/>
+      <w:numFmt w:val="bullet"/>
+      <w:lvlText w:val="●"/>
+      <w:lvlJc w:val="left"/>
+      <w:pPr>
+        <w:ind w:left="5760" w:hanging="360"/>
+      </w:pPr>
+    </w:lvl>
+    <w:lvl w:ilvl="8" w:tplc="7256E1E0" w:tentative="1">
+      <w:start w:val="1"/>
+      <w:numFmt w:val="bullet"/>
+      <w:lvlText w:val="●"/>
+      <w:lvlJc w:val="left"/>
+      <w:pPr>
+        <w:ind w:left="6480" w:hanging="360"/>
+      </w:pPr>
+    </w:lvl>
+  </w:abstractNum>
+  <w:abstractNum w:abstractNumId="2" w15:restartNumberingAfterBreak="0">
+    <w:nsid w:val="44441ECC"/>
+    <w:multiLevelType w:val="hybridMultilevel"/>
+    <w:tmpl w:val="7CECF0C2"/>
+    <w:lvl w:ilvl="0" w:tplc="CF989D52">
       <w:start w:val="1"/>
       <w:numFmt w:val="lowerLetter"/>
       <w:lvlText w:val="%1)"/>
@@ -5642,106 +5728,52 @@
         <w:ind w:left="1069" w:hanging="360"/>
       </w:pPr>
     </w:lvl>
-    <w:lvl w:ilvl="1" w:tplc="AE9C35D6">
+    <w:lvl w:ilvl="1" w:tplc="C45CA1DE">
       <w:numFmt w:val="decimal"/>
       <w:lvlText w:val=""/>
       <w:lvlJc w:val="left"/>
     </w:lvl>
-    <w:lvl w:ilvl="2" w:tplc="B484D0EE">
+    <w:lvl w:ilvl="2" w:tplc="2FB2142E">
       <w:numFmt w:val="decimal"/>
       <w:lvlText w:val=""/>
       <w:lvlJc w:val="left"/>
     </w:lvl>
-    <w:lvl w:ilvl="3" w:tplc="DE3E9F10">
+    <w:lvl w:ilvl="3" w:tplc="949A4F7C">
       <w:numFmt w:val="decimal"/>
       <w:lvlText w:val=""/>
       <w:lvlJc w:val="left"/>
     </w:lvl>
-    <w:lvl w:ilvl="4" w:tplc="ADF2BDC2">
+    <w:lvl w:ilvl="4" w:tplc="CDC6C544">
       <w:numFmt w:val="decimal"/>
       <w:lvlText w:val=""/>
       <w:lvlJc w:val="left"/>
     </w:lvl>
-    <w:lvl w:ilvl="5" w:tplc="4196A6E2">
+    <w:lvl w:ilvl="5" w:tplc="44CE1936">
       <w:numFmt w:val="decimal"/>
       <w:lvlText w:val=""/>
       <w:lvlJc w:val="left"/>
     </w:lvl>
-    <w:lvl w:ilvl="6" w:tplc="D0607E0C">
+    <w:lvl w:ilvl="6" w:tplc="779AAE90">
       <w:numFmt w:val="decimal"/>
       <w:lvlText w:val=""/>
       <w:lvlJc w:val="left"/>
     </w:lvl>
-    <w:lvl w:ilvl="7" w:tplc="25881E14">
+    <w:lvl w:ilvl="7" w:tplc="3786A09C">
       <w:numFmt w:val="decimal"/>
       <w:lvlText w:val=""/>
       <w:lvlJc w:val="left"/>
     </w:lvl>
-    <w:lvl w:ilvl="8" w:tplc="490A867A">
-      <w:numFmt w:val="decimal"/>
-      <w:lvlText w:val=""/>
-      <w:lvlJc w:val="left"/>
-    </w:lvl>
-  </w:abstractNum>
-  <w:abstractNum w:abstractNumId="2" w15:restartNumberingAfterBreak="0">
-    <w:nsid w:val="4CFE670A"/>
-    <w:multiLevelType w:val="hybridMultilevel"/>
-    <w:tmpl w:val="9580E75E"/>
-    <w:lvl w:ilvl="0" w:tplc="9E12A0AE">
-      <w:start w:val="1"/>
-      <w:numFmt w:val="lowerLetter"/>
-      <w:lvlText w:val="%1)"/>
-      <w:lvlJc w:val="left"/>
-      <w:pPr>
-        <w:ind w:left="1069" w:hanging="360"/>
-      </w:pPr>
-    </w:lvl>
-    <w:lvl w:ilvl="1" w:tplc="B1AC8796">
-      <w:numFmt w:val="decimal"/>
-      <w:lvlText w:val=""/>
-      <w:lvlJc w:val="left"/>
-    </w:lvl>
-    <w:lvl w:ilvl="2" w:tplc="15B29DA0">
-      <w:numFmt w:val="decimal"/>
-      <w:lvlText w:val=""/>
-      <w:lvlJc w:val="left"/>
-    </w:lvl>
-    <w:lvl w:ilvl="3" w:tplc="861A09E8">
-      <w:numFmt w:val="decimal"/>
-      <w:lvlText w:val=""/>
-      <w:lvlJc w:val="left"/>
-    </w:lvl>
-    <w:lvl w:ilvl="4" w:tplc="8BCC8BD2">
-      <w:numFmt w:val="decimal"/>
-      <w:lvlText w:val=""/>
-      <w:lvlJc w:val="left"/>
-    </w:lvl>
-    <w:lvl w:ilvl="5" w:tplc="9F40D25E">
-      <w:numFmt w:val="decimal"/>
-      <w:lvlText w:val=""/>
-      <w:lvlJc w:val="left"/>
-    </w:lvl>
-    <w:lvl w:ilvl="6" w:tplc="10C4878C">
-      <w:numFmt w:val="decimal"/>
-      <w:lvlText w:val=""/>
-      <w:lvlJc w:val="left"/>
-    </w:lvl>
-    <w:lvl w:ilvl="7" w:tplc="6E8415AA">
-      <w:numFmt w:val="decimal"/>
-      <w:lvlText w:val=""/>
-      <w:lvlJc w:val="left"/>
-    </w:lvl>
-    <w:lvl w:ilvl="8" w:tplc="7C4864CC">
+    <w:lvl w:ilvl="8" w:tplc="F21E070C">
       <w:numFmt w:val="decimal"/>
       <w:lvlText w:val=""/>
       <w:lvlJc w:val="left"/>
     </w:lvl>
   </w:abstractNum>
   <w:abstractNum w:abstractNumId="3" w15:restartNumberingAfterBreak="0">
-    <w:nsid w:val="5A18050A"/>
+    <w:nsid w:val="44831783"/>
     <w:multiLevelType w:val="hybridMultilevel"/>
-    <w:tmpl w:val="1D8A8F20"/>
-    <w:lvl w:ilvl="0" w:tplc="21A4123A">
+    <w:tmpl w:val="7E96A2A8"/>
+    <w:lvl w:ilvl="0" w:tplc="A0566AA4">
       <w:start w:val="1"/>
       <w:numFmt w:val="lowerLetter"/>
       <w:lvlText w:val="%1)"/>
@@ -5750,159 +5782,127 @@
         <w:ind w:left="1069" w:hanging="360"/>
       </w:pPr>
     </w:lvl>
-    <w:lvl w:ilvl="1" w:tplc="9AB21272">
+    <w:lvl w:ilvl="1" w:tplc="8A3A4692">
       <w:numFmt w:val="decimal"/>
       <w:lvlText w:val=""/>
       <w:lvlJc w:val="left"/>
     </w:lvl>
-    <w:lvl w:ilvl="2" w:tplc="0A14200C">
+    <w:lvl w:ilvl="2" w:tplc="B802BA70">
       <w:numFmt w:val="decimal"/>
       <w:lvlText w:val=""/>
       <w:lvlJc w:val="left"/>
     </w:lvl>
-    <w:lvl w:ilvl="3" w:tplc="BDCCC2CA">
+    <w:lvl w:ilvl="3" w:tplc="DE003D8C">
       <w:numFmt w:val="decimal"/>
       <w:lvlText w:val=""/>
       <w:lvlJc w:val="left"/>
     </w:lvl>
-    <w:lvl w:ilvl="4" w:tplc="4D54EF52">
+    <w:lvl w:ilvl="4" w:tplc="8C84279C">
       <w:numFmt w:val="decimal"/>
       <w:lvlText w:val=""/>
       <w:lvlJc w:val="left"/>
     </w:lvl>
-    <w:lvl w:ilvl="5" w:tplc="9C68CBF6">
+    <w:lvl w:ilvl="5" w:tplc="0AD8678E">
       <w:numFmt w:val="decimal"/>
       <w:lvlText w:val=""/>
       <w:lvlJc w:val="left"/>
     </w:lvl>
-    <w:lvl w:ilvl="6" w:tplc="30EAD02A">
+    <w:lvl w:ilvl="6" w:tplc="3774A486">
       <w:numFmt w:val="decimal"/>
       <w:lvlText w:val=""/>
       <w:lvlJc w:val="left"/>
     </w:lvl>
-    <w:lvl w:ilvl="7" w:tplc="67082DA8">
+    <w:lvl w:ilvl="7" w:tplc="3DDA3FCE">
       <w:numFmt w:val="decimal"/>
       <w:lvlText w:val=""/>
       <w:lvlJc w:val="left"/>
     </w:lvl>
-    <w:lvl w:ilvl="8" w:tplc="F2540ACE">
+    <w:lvl w:ilvl="8" w:tplc="465A3E18">
       <w:numFmt w:val="decimal"/>
       <w:lvlText w:val=""/>
       <w:lvlJc w:val="left"/>
     </w:lvl>
   </w:abstractNum>
   <w:abstractNum w:abstractNumId="4" w15:restartNumberingAfterBreak="0">
-    <w:nsid w:val="5F9C2F07"/>
+    <w:nsid w:val="4FCD3C5A"/>
     <w:multiLevelType w:val="hybridMultilevel"/>
-    <w:tmpl w:val="FBC0995C"/>
-    <w:lvl w:ilvl="0" w:tplc="FACC159E" w:tentative="1">
+    <w:tmpl w:val="FB9AE09E"/>
+    <w:lvl w:ilvl="0" w:tplc="9B464EBE">
       <w:start w:val="1"/>
-      <w:numFmt w:val="bullet"/>
-      <w:lvlText w:val="●"/>
+      <w:numFmt w:val="lowerLetter"/>
+      <w:lvlText w:val="%1)"/>
       <w:lvlJc w:val="left"/>
       <w:pPr>
-        <w:ind w:left="720" w:hanging="360"/>
+        <w:ind w:left="1069" w:hanging="360"/>
       </w:pPr>
     </w:lvl>
-    <w:lvl w:ilvl="1" w:tplc="C4544BD6" w:tentative="1">
-      <w:start w:val="1"/>
-      <w:numFmt w:val="bullet"/>
-      <w:lvlText w:val="○"/>
+    <w:lvl w:ilvl="1" w:tplc="1F5097DE">
+      <w:numFmt w:val="decimal"/>
+      <w:lvlText w:val=""/>
       <w:lvlJc w:val="left"/>
-      <w:pPr>
-        <w:ind w:left="1440" w:hanging="360"/>
-      </w:pPr>
     </w:lvl>
-    <w:lvl w:ilvl="2" w:tplc="D68C406E" w:tentative="1">
-      <w:start w:val="1"/>
-      <w:numFmt w:val="bullet"/>
-      <w:lvlText w:val="■"/>
+    <w:lvl w:ilvl="2" w:tplc="C478D344">
+      <w:numFmt w:val="decimal"/>
+      <w:lvlText w:val=""/>
       <w:lvlJc w:val="left"/>
-      <w:pPr>
-        <w:ind w:left="2160" w:hanging="360"/>
-      </w:pPr>
     </w:lvl>
-    <w:lvl w:ilvl="3" w:tplc="12BE3EC4" w:tentative="1">
-      <w:start w:val="1"/>
-      <w:numFmt w:val="bullet"/>
-      <w:lvlText w:val="●"/>
+    <w:lvl w:ilvl="3" w:tplc="6B32B412">
+      <w:numFmt w:val="decimal"/>
+      <w:lvlText w:val=""/>
       <w:lvlJc w:val="left"/>
-      <w:pPr>
-        <w:ind w:left="2880" w:hanging="360"/>
-      </w:pPr>
     </w:lvl>
-    <w:lvl w:ilvl="4" w:tplc="4CFA91F0" w:tentative="1">
-      <w:start w:val="1"/>
-      <w:numFmt w:val="bullet"/>
-      <w:lvlText w:val="○"/>
+    <w:lvl w:ilvl="4" w:tplc="95A8E53E">
+      <w:numFmt w:val="decimal"/>
+      <w:lvlText w:val=""/>
       <w:lvlJc w:val="left"/>
-      <w:pPr>
-        <w:ind w:left="3600" w:hanging="360"/>
-      </w:pPr>
     </w:lvl>
-    <w:lvl w:ilvl="5" w:tplc="1AE4F042" w:tentative="1">
-      <w:start w:val="1"/>
-      <w:numFmt w:val="bullet"/>
-      <w:lvlText w:val="■"/>
+    <w:lvl w:ilvl="5" w:tplc="3048C7DA">
+      <w:numFmt w:val="decimal"/>
+      <w:lvlText w:val=""/>
       <w:lvlJc w:val="left"/>
-      <w:pPr>
-        <w:ind w:left="4320" w:hanging="360"/>
-      </w:pPr>
     </w:lvl>
-    <w:lvl w:ilvl="6" w:tplc="A5F66700" w:tentative="1">
-      <w:start w:val="1"/>
-      <w:numFmt w:val="bullet"/>
-      <w:lvlText w:val="●"/>
+    <w:lvl w:ilvl="6" w:tplc="73C84D9E">
+      <w:numFmt w:val="decimal"/>
+      <w:lvlText w:val=""/>
       <w:lvlJc w:val="left"/>
-      <w:pPr>
-        <w:ind w:left="5040" w:hanging="360"/>
-      </w:pPr>
     </w:lvl>
-    <w:lvl w:ilvl="7" w:tplc="FE5C9328" w:tentative="1">
-      <w:start w:val="1"/>
-      <w:numFmt w:val="bullet"/>
-      <w:lvlText w:val="●"/>
+    <w:lvl w:ilvl="7" w:tplc="FB823666">
+      <w:numFmt w:val="decimal"/>
+      <w:lvlText w:val=""/>
       <w:lvlJc w:val="left"/>
-      <w:pPr>
-        <w:ind w:left="5760" w:hanging="360"/>
-      </w:pPr>
     </w:lvl>
-    <w:lvl w:ilvl="8" w:tplc="EB0E036C" w:tentative="1">
-      <w:start w:val="1"/>
-      <w:numFmt w:val="bullet"/>
-      <w:lvlText w:val="●"/>
+    <w:lvl w:ilvl="8" w:tplc="495CC410">
+      <w:numFmt w:val="decimal"/>
+      <w:lvlText w:val=""/>
       <w:lvlJc w:val="left"/>
-      <w:pPr>
-        <w:ind w:left="6480" w:hanging="360"/>
-      </w:pPr>
     </w:lvl>
   </w:abstractNum>
-  <w:num w:numId="1" w16cid:durableId="1712150424">
-    <w:abstractNumId w:val="4"/>
+  <w:num w:numId="1" w16cid:durableId="1280526749">
+    <w:abstractNumId w:val="1"/>
     <w:lvlOverride w:ilvl="0">
       <w:startOverride w:val="1"/>
     </w:lvlOverride>
   </w:num>
-  <w:num w:numId="2" w16cid:durableId="148861861">
+  <w:num w:numId="2" w16cid:durableId="1458641653">
+    <w:abstractNumId w:val="0"/>
+    <w:lvlOverride w:ilvl="0">
+      <w:startOverride w:val="1"/>
+    </w:lvlOverride>
+  </w:num>
+  <w:num w:numId="3" w16cid:durableId="776944554">
+    <w:abstractNumId w:val="2"/>
+    <w:lvlOverride w:ilvl="0">
+      <w:startOverride w:val="1"/>
+    </w:lvlOverride>
+  </w:num>
+  <w:num w:numId="4" w16cid:durableId="691146092">
     <w:abstractNumId w:val="3"/>
     <w:lvlOverride w:ilvl="0">
       <w:startOverride w:val="1"/>
     </w:lvlOverride>
   </w:num>
-  <w:num w:numId="3" w16cid:durableId="1855224649">
-    <w:abstractNumId w:val="1"/>
-    <w:lvlOverride w:ilvl="0">
-      <w:startOverride w:val="1"/>
-    </w:lvlOverride>
-  </w:num>
-  <w:num w:numId="4" w16cid:durableId="2048597624">
-    <w:abstractNumId w:val="2"/>
-    <w:lvlOverride w:ilvl="0">
-      <w:startOverride w:val="1"/>
-    </w:lvlOverride>
-  </w:num>
-  <w:num w:numId="5" w16cid:durableId="795022056">
-    <w:abstractNumId w:val="0"/>
+  <w:num w:numId="5" w16cid:durableId="2049715043">
+    <w:abstractNumId w:val="4"/>
     <w:lvlOverride w:ilvl="0">
       <w:startOverride w:val="1"/>
     </w:lvlOverride>
@@ -6455,6 +6455,116 @@
     <w:basedOn w:val="Normal"/>
     <w:qFormat/>
   </w:style>
+  <w:style w:type="paragraph" w:styleId="Legenda">
+    <w:name w:val="caption"/>
+    <w:basedOn w:val="Normal"/>
+    <w:next w:val="Normal"/>
+    <w:uiPriority w:val="35"/>
+    <w:semiHidden/>
+    <w:unhideWhenUsed/>
+    <w:qFormat/>
+    <w:pPr>
+      <w:spacing w:after="200"/>
+    </w:pPr>
+    <w:rPr>
+      <w:i/>
+      <w:iCs/>
+      <w:color w:val="44546A" w:themeColor="dark2"/>
+      <w:sz w:val="18"/>
+      <w:szCs w:val="18"/>
+    </w:rPr>
+  </w:style>
+  <w:style w:type="paragraph" w:styleId="Bibliografia">
+    <w:name w:val="Bibliography"/>
+    <w:basedOn w:val="Normal"/>
+    <w:next w:val="Normal"/>
+    <w:uiPriority w:val="37"/>
+    <w:unhideWhenUsed/>
+  </w:style>
+  <w:style w:type="paragraph" w:styleId="Sumrio3">
+    <w:name w:val="toc 3"/>
+    <w:basedOn w:val="Normal"/>
+    <w:next w:val="Normal"/>
+    <w:uiPriority w:val="39"/>
+    <w:semiHidden/>
+    <w:unhideWhenUsed/>
+    <w:pPr>
+      <w:spacing w:after="100"/>
+      <w:ind w:left="480"/>
+    </w:pPr>
+  </w:style>
+  <w:style w:type="paragraph" w:styleId="Sumrio4">
+    <w:name w:val="toc 4"/>
+    <w:basedOn w:val="Normal"/>
+    <w:next w:val="Normal"/>
+    <w:uiPriority w:val="39"/>
+    <w:semiHidden/>
+    <w:unhideWhenUsed/>
+    <w:pPr>
+      <w:spacing w:after="100"/>
+      <w:ind w:left="720"/>
+    </w:pPr>
+  </w:style>
+  <w:style w:type="paragraph" w:styleId="Sumrio5">
+    <w:name w:val="toc 5"/>
+    <w:basedOn w:val="Normal"/>
+    <w:next w:val="Normal"/>
+    <w:uiPriority w:val="39"/>
+    <w:semiHidden/>
+    <w:unhideWhenUsed/>
+    <w:pPr>
+      <w:spacing w:after="100"/>
+      <w:ind w:left="960"/>
+    </w:pPr>
+  </w:style>
+  <w:style w:type="paragraph" w:styleId="Sumrio6">
+    <w:name w:val="toc 6"/>
+    <w:basedOn w:val="Normal"/>
+    <w:next w:val="Normal"/>
+    <w:uiPriority w:val="39"/>
+    <w:semiHidden/>
+    <w:unhideWhenUsed/>
+    <w:pPr>
+      <w:spacing w:after="100"/>
+      <w:ind w:left="1200"/>
+    </w:pPr>
+  </w:style>
+  <w:style w:type="paragraph" w:styleId="Sumrio7">
+    <w:name w:val="toc 7"/>
+    <w:basedOn w:val="Normal"/>
+    <w:next w:val="Normal"/>
+    <w:uiPriority w:val="39"/>
+    <w:semiHidden/>
+    <w:unhideWhenUsed/>
+    <w:pPr>
+      <w:spacing w:after="100"/>
+      <w:ind w:left="1440"/>
+    </w:pPr>
+  </w:style>
+  <w:style w:type="paragraph" w:styleId="Sumrio8">
+    <w:name w:val="toc 8"/>
+    <w:basedOn w:val="Normal"/>
+    <w:next w:val="Normal"/>
+    <w:uiPriority w:val="39"/>
+    <w:semiHidden/>
+    <w:unhideWhenUsed/>
+    <w:pPr>
+      <w:spacing w:after="100"/>
+      <w:ind w:left="1680"/>
+    </w:pPr>
+  </w:style>
+  <w:style w:type="paragraph" w:styleId="Sumrio9">
+    <w:name w:val="toc 9"/>
+    <w:basedOn w:val="Normal"/>
+    <w:next w:val="Normal"/>
+    <w:uiPriority w:val="39"/>
+    <w:semiHidden/>
+    <w:unhideWhenUsed/>
+    <w:pPr>
+      <w:spacing w:after="100"/>
+      <w:ind w:left="1920"/>
+    </w:pPr>
+  </w:style>
   <w:style w:type="character" w:styleId="Hyperlink">
     <w:name w:val="Hyperlink"/>
     <w:uiPriority w:val="99"/>
@@ -6533,6 +6643,12 @@
       <w:sz w:val="20"/>
       <w:szCs w:val="20"/>
     </w:rPr>
+  </w:style>
+  <w:style w:type="character" w:styleId="Nmerodelinha">
+    <w:name w:val="line number"/>
+    <w:uiPriority w:val="99"/>
+    <w:semiHidden/>
+    <w:unhideWhenUsed/>
   </w:style>
   <w:style w:type="paragraph" w:styleId="Sumrio1">
     <w:name w:val="toc 1"/>

</xml_diff>

<commit_message>
Update documentation and tests; correct piece symbols and test cases
</commit_message>
<xml_diff>
--- a/docs/T1_BuscaCompetitiva_Damas.docx
+++ b/docs/T1_BuscaCompetitiva_Damas.docx
@@ -224,7 +224,7 @@
           <w:bCs w:val="0"/>
         </w:rPr>
         <w:alias w:val="Sumário"/>
-        <w:id w:val="-1147973793"/>
+        <w:id w:val="1051035607"/>
       </w:sdtPr>
       <w:sdtEndPr/>
       <w:sdtContent>
@@ -252,7 +252,7 @@
           <w:r>
             <w:fldChar w:fldCharType="separate"/>
           </w:r>
-          <w:hyperlink w:anchor="_Toc243689198" w:history="1">
+          <w:hyperlink w:anchor="_Toc243689382" w:history="1">
             <w:r>
               <w:rPr>
                 <w:rStyle w:val="Hyperlink"/>
@@ -276,7 +276,7 @@
               <w:rPr>
                 <w:noProof/>
               </w:rPr>
-              <w:instrText xml:space="preserve"> PAGEREF _Toc243689198 \h </w:instrText>
+              <w:instrText xml:space="preserve"> PAGEREF _Toc243689382 \h </w:instrText>
             </w:r>
             <w:r>
               <w:rPr>
@@ -316,7 +316,7 @@
               <w14:ligatures w14:val="standardContextual"/>
             </w:rPr>
           </w:pPr>
-          <w:hyperlink w:anchor="_Toc243689199" w:history="1">
+          <w:hyperlink w:anchor="_Toc243689383" w:history="1">
             <w:r>
               <w:rPr>
                 <w:rStyle w:val="Hyperlink"/>
@@ -340,7 +340,7 @@
               <w:rPr>
                 <w:noProof/>
               </w:rPr>
-              <w:instrText xml:space="preserve"> PAGEREF _Toc243689199 \h </w:instrText>
+              <w:instrText xml:space="preserve"> PAGEREF _Toc243689383 \h </w:instrText>
             </w:r>
             <w:r>
               <w:rPr>
@@ -382,7 +382,7 @@
               <w14:ligatures w14:val="standardContextual"/>
             </w:rPr>
           </w:pPr>
-          <w:hyperlink w:anchor="_Toc243689200" w:history="1">
+          <w:hyperlink w:anchor="_Toc243689384" w:history="1">
             <w:r>
               <w:rPr>
                 <w:rStyle w:val="Hyperlink"/>
@@ -406,7 +406,7 @@
               <w:rPr>
                 <w:noProof/>
               </w:rPr>
-              <w:instrText xml:space="preserve"> PAGEREF _Toc243689200 \h </w:instrText>
+              <w:instrText xml:space="preserve"> PAGEREF _Toc243689384 \h </w:instrText>
             </w:r>
             <w:r>
               <w:rPr>
@@ -448,7 +448,7 @@
               <w14:ligatures w14:val="standardContextual"/>
             </w:rPr>
           </w:pPr>
-          <w:hyperlink w:anchor="_Toc243689201" w:history="1">
+          <w:hyperlink w:anchor="_Toc243689385" w:history="1">
             <w:r>
               <w:rPr>
                 <w:rStyle w:val="Hyperlink"/>
@@ -472,7 +472,7 @@
               <w:rPr>
                 <w:noProof/>
               </w:rPr>
-              <w:instrText xml:space="preserve"> PAGEREF _Toc243689201 \h </w:instrText>
+              <w:instrText xml:space="preserve"> PAGEREF _Toc243689385 \h </w:instrText>
             </w:r>
             <w:r>
               <w:rPr>
@@ -514,7 +514,7 @@
               <w14:ligatures w14:val="standardContextual"/>
             </w:rPr>
           </w:pPr>
-          <w:hyperlink w:anchor="_Toc243689202" w:history="1">
+          <w:hyperlink w:anchor="_Toc243689386" w:history="1">
             <w:r>
               <w:rPr>
                 <w:rStyle w:val="Hyperlink"/>
@@ -538,7 +538,7 @@
               <w:rPr>
                 <w:noProof/>
               </w:rPr>
-              <w:instrText xml:space="preserve"> PAGEREF _Toc243689202 \h </w:instrText>
+              <w:instrText xml:space="preserve"> PAGEREF _Toc243689386 \h </w:instrText>
             </w:r>
             <w:r>
               <w:rPr>
@@ -578,7 +578,7 @@
               <w14:ligatures w14:val="standardContextual"/>
             </w:rPr>
           </w:pPr>
-          <w:hyperlink w:anchor="_Toc243689203" w:history="1">
+          <w:hyperlink w:anchor="_Toc243689387" w:history="1">
             <w:r>
               <w:rPr>
                 <w:rStyle w:val="Hyperlink"/>
@@ -602,7 +602,7 @@
               <w:rPr>
                 <w:noProof/>
               </w:rPr>
-              <w:instrText xml:space="preserve"> PAGEREF _Toc243689203 \h </w:instrText>
+              <w:instrText xml:space="preserve"> PAGEREF _Toc243689387 \h </w:instrText>
             </w:r>
             <w:r>
               <w:rPr>
@@ -642,7 +642,7 @@
               <w14:ligatures w14:val="standardContextual"/>
             </w:rPr>
           </w:pPr>
-          <w:hyperlink w:anchor="_Toc243689204" w:history="1">
+          <w:hyperlink w:anchor="_Toc243689388" w:history="1">
             <w:r>
               <w:rPr>
                 <w:rStyle w:val="Hyperlink"/>
@@ -666,7 +666,7 @@
               <w:rPr>
                 <w:noProof/>
               </w:rPr>
-              <w:instrText xml:space="preserve"> PAGEREF _Toc243689204 \h </w:instrText>
+              <w:instrText xml:space="preserve"> PAGEREF _Toc243689388 \h </w:instrText>
             </w:r>
             <w:r>
               <w:rPr>
@@ -706,7 +706,7 @@
               <w14:ligatures w14:val="standardContextual"/>
             </w:rPr>
           </w:pPr>
-          <w:hyperlink w:anchor="_Toc243689205" w:history="1">
+          <w:hyperlink w:anchor="_Toc243689389" w:history="1">
             <w:r>
               <w:rPr>
                 <w:rStyle w:val="Hyperlink"/>
@@ -730,7 +730,7 @@
               <w:rPr>
                 <w:noProof/>
               </w:rPr>
-              <w:instrText xml:space="preserve"> PAGEREF _Toc243689205 \h </w:instrText>
+              <w:instrText xml:space="preserve"> PAGEREF _Toc243689389 \h </w:instrText>
             </w:r>
             <w:r>
               <w:rPr>
@@ -770,7 +770,7 @@
               <w14:ligatures w14:val="standardContextual"/>
             </w:rPr>
           </w:pPr>
-          <w:hyperlink w:anchor="_Toc243689206" w:history="1">
+          <w:hyperlink w:anchor="_Toc243689390" w:history="1">
             <w:r>
               <w:rPr>
                 <w:rStyle w:val="Hyperlink"/>
@@ -794,7 +794,7 @@
               <w:rPr>
                 <w:noProof/>
               </w:rPr>
-              <w:instrText xml:space="preserve"> PAGEREF _Toc243689206 \h </w:instrText>
+              <w:instrText xml:space="preserve"> PAGEREF _Toc243689390 \h </w:instrText>
             </w:r>
             <w:r>
               <w:rPr>
@@ -836,7 +836,7 @@
               <w14:ligatures w14:val="standardContextual"/>
             </w:rPr>
           </w:pPr>
-          <w:hyperlink w:anchor="_Toc243689207" w:history="1">
+          <w:hyperlink w:anchor="_Toc243689391" w:history="1">
             <w:r>
               <w:rPr>
                 <w:rStyle w:val="Hyperlink"/>
@@ -860,7 +860,7 @@
               <w:rPr>
                 <w:noProof/>
               </w:rPr>
-              <w:instrText xml:space="preserve"> PAGEREF _Toc243689207 \h </w:instrText>
+              <w:instrText xml:space="preserve"> PAGEREF _Toc243689391 \h </w:instrText>
             </w:r>
             <w:r>
               <w:rPr>
@@ -902,7 +902,7 @@
               <w14:ligatures w14:val="standardContextual"/>
             </w:rPr>
           </w:pPr>
-          <w:hyperlink w:anchor="_Toc243689208" w:history="1">
+          <w:hyperlink w:anchor="_Toc243689392" w:history="1">
             <w:r>
               <w:rPr>
                 <w:rStyle w:val="Hyperlink"/>
@@ -926,7 +926,7 @@
               <w:rPr>
                 <w:noProof/>
               </w:rPr>
-              <w:instrText xml:space="preserve"> PAGEREF _Toc243689208 \h </w:instrText>
+              <w:instrText xml:space="preserve"> PAGEREF _Toc243689392 \h </w:instrText>
             </w:r>
             <w:r>
               <w:rPr>
@@ -968,7 +968,7 @@
               <w14:ligatures w14:val="standardContextual"/>
             </w:rPr>
           </w:pPr>
-          <w:hyperlink w:anchor="_Toc243689209" w:history="1">
+          <w:hyperlink w:anchor="_Toc243689393" w:history="1">
             <w:r>
               <w:rPr>
                 <w:rStyle w:val="Hyperlink"/>
@@ -992,7 +992,7 @@
               <w:rPr>
                 <w:noProof/>
               </w:rPr>
-              <w:instrText xml:space="preserve"> PAGEREF _Toc243689209 \h </w:instrText>
+              <w:instrText xml:space="preserve"> PAGEREF _Toc243689393 \h </w:instrText>
             </w:r>
             <w:r>
               <w:rPr>
@@ -1034,7 +1034,7 @@
               <w14:ligatures w14:val="standardContextual"/>
             </w:rPr>
           </w:pPr>
-          <w:hyperlink w:anchor="_Toc243689210" w:history="1">
+          <w:hyperlink w:anchor="_Toc243689394" w:history="1">
             <w:r>
               <w:rPr>
                 <w:rStyle w:val="Hyperlink"/>
@@ -1058,7 +1058,7 @@
               <w:rPr>
                 <w:noProof/>
               </w:rPr>
-              <w:instrText xml:space="preserve"> PAGEREF _Toc243689210 \h </w:instrText>
+              <w:instrText xml:space="preserve"> PAGEREF _Toc243689394 \h </w:instrText>
             </w:r>
             <w:r>
               <w:rPr>
@@ -1110,7 +1110,7 @@
         <w:pageBreakBefore/>
         <w:spacing w:after="360"/>
       </w:pPr>
-      <w:bookmarkStart w:id="0" w:name="_Toc243689198"/>
+      <w:bookmarkStart w:id="0" w:name="_Toc243689382"/>
       <w:r>
         <w:t>1 O JOGO ESCOLHIDO: DAMAS</w:t>
       </w:r>
@@ -1141,7 +1141,7 @@
         <w:keepNext/>
         <w:spacing w:before="360" w:after="360"/>
       </w:pPr>
-      <w:bookmarkStart w:id="1" w:name="_Toc243689199"/>
+      <w:bookmarkStart w:id="1" w:name="_Toc243689383"/>
       <w:r>
         <w:t>1.1 Regras</w:t>
       </w:r>
@@ -1348,7 +1348,7 @@
         <w:pageBreakBefore/>
         <w:spacing w:after="360"/>
       </w:pPr>
-      <w:bookmarkStart w:id="2" w:name="_Toc243689200"/>
+      <w:bookmarkStart w:id="2" w:name="_Toc243689384"/>
       <w:r>
         <w:t>2 FORMULAÇÃO DO PROBLEMA DE BUSCA</w:t>
       </w:r>
@@ -1971,7 +1971,7 @@
         <w:pageBreakBefore/>
         <w:spacing w:after="360"/>
       </w:pPr>
-      <w:bookmarkStart w:id="3" w:name="_Toc243689201"/>
+      <w:bookmarkStart w:id="3" w:name="_Toc243689385"/>
       <w:r>
         <w:t>3 TIPO DE JOGO: DETERMINÍSTICO</w:t>
       </w:r>
@@ -2091,7 +2091,7 @@
         <w:pageBreakBefore/>
         <w:spacing w:after="360"/>
       </w:pPr>
-      <w:bookmarkStart w:id="4" w:name="_Toc243689202"/>
+      <w:bookmarkStart w:id="4" w:name="_Toc243689386"/>
       <w:r>
         <w:t>4 ALGORITMO ESCOLHIDO: MINIMAX COM PODA ALFA-BETA</w:t>
       </w:r>
@@ -2103,7 +2103,7 @@
         <w:keepNext/>
         <w:spacing w:before="360" w:after="360"/>
       </w:pPr>
-      <w:bookmarkStart w:id="5" w:name="_Toc243689203"/>
+      <w:bookmarkStart w:id="5" w:name="_Toc243689387"/>
       <w:r>
         <w:t>4.1 Por que este algoritmo</w:t>
       </w:r>
@@ -2225,7 +2225,7 @@
         <w:keepNext/>
         <w:spacing w:before="360" w:after="360"/>
       </w:pPr>
-      <w:bookmarkStart w:id="6" w:name="_Toc243689204"/>
+      <w:bookmarkStart w:id="6" w:name="_Toc243689388"/>
       <w:r>
         <w:t>4.2 Função heurística (avaliação de estados não terminais)</w:t>
       </w:r>
@@ -2618,7 +2618,7 @@
         <w:keepNext/>
         <w:spacing w:before="360" w:after="360"/>
       </w:pPr>
-      <w:bookmarkStart w:id="7" w:name="_Toc243689205"/>
+      <w:bookmarkStart w:id="7" w:name="_Toc243689389"/>
       <w:r>
         <w:t>4.3 Pseudocódigo</w:t>
       </w:r>
@@ -2950,7 +2950,7 @@
         <w:keepNext/>
         <w:spacing w:before="360" w:after="360"/>
       </w:pPr>
-      <w:bookmarkStart w:id="8" w:name="_Toc243689206"/>
+      <w:bookmarkStart w:id="8" w:name="_Toc243689390"/>
       <w:r>
         <w:t>4.4 Resultado medido: efeito da poda</w:t>
       </w:r>
@@ -3795,7 +3795,7 @@
         <w:pageBreakBefore/>
         <w:spacing w:after="360"/>
       </w:pPr>
-      <w:bookmarkStart w:id="9" w:name="_Toc243689207"/>
+      <w:bookmarkStart w:id="9" w:name="_Toc243689391"/>
       <w:r>
         <w:t>5 IMPLEMENTAÇÃO EM PYTHON</w:t>
       </w:r>
@@ -4344,7 +4344,7 @@
                 <w:sz w:val="20"/>
                 <w:szCs w:val="20"/>
               </w:rPr>
-              <w:t>45 testes automáticos: regras (incluindo casos difíceis da dama voadora), desenho, menus, entradas do jogador e decisões da IA.</w:t>
+              <w:t>46 testes automáticos: regras (incluindo casos difíceis da dama voadora), desenho, menus, entradas do jogador e decisões da IA.</w:t>
             </w:r>
           </w:p>
         </w:tc>
@@ -4414,7 +4414,7 @@
         <w:pageBreakBefore/>
         <w:spacing w:after="360"/>
       </w:pPr>
-      <w:bookmarkStart w:id="10" w:name="_Toc243689208"/>
+      <w:bookmarkStart w:id="10" w:name="_Toc243689392"/>
       <w:r>
         <w:t>6 REFLEXÃO: FOI O ALGORITMO MAIS INDICADO?</w:t>
       </w:r>
@@ -4583,7 +4583,7 @@
         <w:pageBreakBefore/>
         <w:spacing w:after="360"/>
       </w:pPr>
-      <w:bookmarkStart w:id="11" w:name="_Toc243689209"/>
+      <w:bookmarkStart w:id="11" w:name="_Toc243689393"/>
       <w:r>
         <w:t>7 ORGANIZAÇÃO DO GRUPO</w:t>
       </w:r>
@@ -5385,7 +5385,7 @@
         <w:spacing w:after="360"/>
         <w:jc w:val="center"/>
       </w:pPr>
-      <w:bookmarkStart w:id="12" w:name="_Toc243689210"/>
+      <w:bookmarkStart w:id="12" w:name="_Toc243689394"/>
       <w:r>
         <w:t>REFERÊNCIAS</w:t>
       </w:r>
@@ -5576,10 +5576,10 @@
 <file path=word/numbering.xml><?xml version="1.0" encoding="utf-8"?>
 <w:numbering xmlns:wpc="http://schemas.microsoft.com/office/word/2010/wordprocessingCanvas" xmlns:cx="http://schemas.microsoft.com/office/drawing/2014/chartex" xmlns:cx1="http://schemas.microsoft.com/office/drawing/2015/9/8/chartex" xmlns:cx2="http://schemas.microsoft.com/office/drawing/2015/10/21/chartex" xmlns:cx3="http://schemas.microsoft.com/office/drawing/2016/5/9/chartex" xmlns:cx4="http://schemas.microsoft.com/office/drawing/2016/5/10/chartex" xmlns:cx5="http://schemas.microsoft.com/office/drawing/2016/5/11/chartex" xmlns:cx6="http://schemas.microsoft.com/office/drawing/2016/5/12/chartex" xmlns:cx7="http://schemas.microsoft.com/office/drawing/2016/5/13/chartex" xmlns:cx8="http://schemas.microsoft.com/office/drawing/2016/5/14/chartex" xmlns:mc="http://schemas.openxmlformats.org/markup-compatibility/2006" xmlns:aink="http://schemas.microsoft.com/office/drawing/2016/ink" xmlns:am3d="http://schemas.microsoft.com/office/drawing/2017/model3d" xmlns:o="urn:schemas-microsoft-com:office:office" xmlns:oel="http://schemas.microsoft.com/office/2019/extlst" xmlns:r="http://schemas.openxmlformats.org/officeDocument/2006/relationships" xmlns:m="http://schemas.openxmlformats.org/officeDocument/2006/math" xmlns:v="urn:schemas-microsoft-com:vml" xmlns:wp14="http://schemas.microsoft.com/office/word/2010/wordprocessingDrawing" xmlns:wp="http://schemas.openxmlformats.org/drawingml/2006/wordprocessingDrawing" xmlns:w10="urn:schemas-microsoft-com:office:word" xmlns:w="http://schemas.openxmlformats.org/wordprocessingml/2006/main" xmlns:w14="http://schemas.microsoft.com/office/word/2010/wordml" xmlns:w15="http://schemas.microsoft.com/office/word/2012/wordml" xmlns:w16cex="http://schemas.microsoft.com/office/word/2018/wordml/cex" xmlns:w16cid="http://schemas.microsoft.com/office/word/2016/wordml/cid" xmlns:w16="http://schemas.microsoft.com/office/word/2018/wordml" xmlns:w16du="http://schemas.microsoft.com/office/word/2023/wordml/word16du" xmlns:w16sdtdh="http://schemas.microsoft.com/office/word/2020/wordml/sdtdatahash" xmlns:w16sdtfl="http://schemas.microsoft.com/office/word/2024/wordml/sdtformatlock" xmlns:w16se="http://schemas.microsoft.com/office/word/2015/wordml/symex" xmlns:wpg="http://schemas.microsoft.com/office/word/2010/wordprocessingGroup" xmlns:wpi="http://schemas.microsoft.com/office/word/2010/wordprocessingInk" xmlns:wne="http://schemas.microsoft.com/office/word/2006/wordml" xmlns:wps="http://schemas.microsoft.com/office/word/2010/wordprocessingShape" mc:Ignorable="w14 w15 w16se w16cid w16 w16cex w16sdtdh w16sdtfl w16du wp14">
   <w:abstractNum w:abstractNumId="0" w15:restartNumberingAfterBreak="0">
-    <w:nsid w:val="10374991"/>
+    <w:nsid w:val="1C866A17"/>
     <w:multiLevelType w:val="hybridMultilevel"/>
-    <w:tmpl w:val="FD6CD8B6"/>
-    <w:lvl w:ilvl="0" w:tplc="5E2C2F90">
+    <w:tmpl w:val="723AA5C0"/>
+    <w:lvl w:ilvl="0" w:tplc="608C719C">
       <w:start w:val="1"/>
       <w:numFmt w:val="lowerLetter"/>
       <w:lvlText w:val="%1)"/>
@@ -5588,138 +5588,52 @@
         <w:ind w:left="1069" w:hanging="360"/>
       </w:pPr>
     </w:lvl>
-    <w:lvl w:ilvl="1" w:tplc="1CD681F0">
+    <w:lvl w:ilvl="1" w:tplc="FDD477B6">
       <w:numFmt w:val="decimal"/>
       <w:lvlText w:val=""/>
       <w:lvlJc w:val="left"/>
     </w:lvl>
-    <w:lvl w:ilvl="2" w:tplc="6D50EDE4">
+    <w:lvl w:ilvl="2" w:tplc="DD28FABC">
       <w:numFmt w:val="decimal"/>
       <w:lvlText w:val=""/>
       <w:lvlJc w:val="left"/>
     </w:lvl>
-    <w:lvl w:ilvl="3" w:tplc="D8F0E6C8">
+    <w:lvl w:ilvl="3" w:tplc="C37E4798">
       <w:numFmt w:val="decimal"/>
       <w:lvlText w:val=""/>
       <w:lvlJc w:val="left"/>
     </w:lvl>
-    <w:lvl w:ilvl="4" w:tplc="2AEC2B76">
+    <w:lvl w:ilvl="4" w:tplc="DE58693E">
       <w:numFmt w:val="decimal"/>
       <w:lvlText w:val=""/>
       <w:lvlJc w:val="left"/>
     </w:lvl>
-    <w:lvl w:ilvl="5" w:tplc="CB14491A">
+    <w:lvl w:ilvl="5" w:tplc="F7041590">
       <w:numFmt w:val="decimal"/>
       <w:lvlText w:val=""/>
       <w:lvlJc w:val="left"/>
     </w:lvl>
-    <w:lvl w:ilvl="6" w:tplc="B9441B44">
+    <w:lvl w:ilvl="6" w:tplc="AA0E599C">
       <w:numFmt w:val="decimal"/>
       <w:lvlText w:val=""/>
       <w:lvlJc w:val="left"/>
     </w:lvl>
-    <w:lvl w:ilvl="7" w:tplc="87FE8344">
+    <w:lvl w:ilvl="7" w:tplc="0E8A455A">
       <w:numFmt w:val="decimal"/>
       <w:lvlText w:val=""/>
       <w:lvlJc w:val="left"/>
     </w:lvl>
-    <w:lvl w:ilvl="8" w:tplc="55A0457C">
+    <w:lvl w:ilvl="8" w:tplc="E9AE49A6">
       <w:numFmt w:val="decimal"/>
       <w:lvlText w:val=""/>
       <w:lvlJc w:val="left"/>
     </w:lvl>
   </w:abstractNum>
   <w:abstractNum w:abstractNumId="1" w15:restartNumberingAfterBreak="0">
-    <w:nsid w:val="1A3403F4"/>
+    <w:nsid w:val="2C8A66A4"/>
     <w:multiLevelType w:val="hybridMultilevel"/>
-    <w:tmpl w:val="89FE4CF6"/>
-    <w:lvl w:ilvl="0" w:tplc="FA1E1CD0" w:tentative="1">
-      <w:start w:val="1"/>
-      <w:numFmt w:val="bullet"/>
-      <w:lvlText w:val="●"/>
-      <w:lvlJc w:val="left"/>
-      <w:pPr>
-        <w:ind w:left="720" w:hanging="360"/>
-      </w:pPr>
-    </w:lvl>
-    <w:lvl w:ilvl="1" w:tplc="C5DACB82" w:tentative="1">
-      <w:start w:val="1"/>
-      <w:numFmt w:val="bullet"/>
-      <w:lvlText w:val="○"/>
-      <w:lvlJc w:val="left"/>
-      <w:pPr>
-        <w:ind w:left="1440" w:hanging="360"/>
-      </w:pPr>
-    </w:lvl>
-    <w:lvl w:ilvl="2" w:tplc="D00A8E2C" w:tentative="1">
-      <w:start w:val="1"/>
-      <w:numFmt w:val="bullet"/>
-      <w:lvlText w:val="■"/>
-      <w:lvlJc w:val="left"/>
-      <w:pPr>
-        <w:ind w:left="2160" w:hanging="360"/>
-      </w:pPr>
-    </w:lvl>
-    <w:lvl w:ilvl="3" w:tplc="8F68EBBC" w:tentative="1">
-      <w:start w:val="1"/>
-      <w:numFmt w:val="bullet"/>
-      <w:lvlText w:val="●"/>
-      <w:lvlJc w:val="left"/>
-      <w:pPr>
-        <w:ind w:left="2880" w:hanging="360"/>
-      </w:pPr>
-    </w:lvl>
-    <w:lvl w:ilvl="4" w:tplc="316414DE" w:tentative="1">
-      <w:start w:val="1"/>
-      <w:numFmt w:val="bullet"/>
-      <w:lvlText w:val="○"/>
-      <w:lvlJc w:val="left"/>
-      <w:pPr>
-        <w:ind w:left="3600" w:hanging="360"/>
-      </w:pPr>
-    </w:lvl>
-    <w:lvl w:ilvl="5" w:tplc="D102AECE" w:tentative="1">
-      <w:start w:val="1"/>
-      <w:numFmt w:val="bullet"/>
-      <w:lvlText w:val="■"/>
-      <w:lvlJc w:val="left"/>
-      <w:pPr>
-        <w:ind w:left="4320" w:hanging="360"/>
-      </w:pPr>
-    </w:lvl>
-    <w:lvl w:ilvl="6" w:tplc="91840D02" w:tentative="1">
-      <w:start w:val="1"/>
-      <w:numFmt w:val="bullet"/>
-      <w:lvlText w:val="●"/>
-      <w:lvlJc w:val="left"/>
-      <w:pPr>
-        <w:ind w:left="5040" w:hanging="360"/>
-      </w:pPr>
-    </w:lvl>
-    <w:lvl w:ilvl="7" w:tplc="804EA348" w:tentative="1">
-      <w:start w:val="1"/>
-      <w:numFmt w:val="bullet"/>
-      <w:lvlText w:val="●"/>
-      <w:lvlJc w:val="left"/>
-      <w:pPr>
-        <w:ind w:left="5760" w:hanging="360"/>
-      </w:pPr>
-    </w:lvl>
-    <w:lvl w:ilvl="8" w:tplc="7256E1E0" w:tentative="1">
-      <w:start w:val="1"/>
-      <w:numFmt w:val="bullet"/>
-      <w:lvlText w:val="●"/>
-      <w:lvlJc w:val="left"/>
-      <w:pPr>
-        <w:ind w:left="6480" w:hanging="360"/>
-      </w:pPr>
-    </w:lvl>
-  </w:abstractNum>
-  <w:abstractNum w:abstractNumId="2" w15:restartNumberingAfterBreak="0">
-    <w:nsid w:val="44441ECC"/>
-    <w:multiLevelType w:val="hybridMultilevel"/>
-    <w:tmpl w:val="7CECF0C2"/>
-    <w:lvl w:ilvl="0" w:tplc="CF989D52">
+    <w:tmpl w:val="030A1890"/>
+    <w:lvl w:ilvl="0" w:tplc="CF66380E">
       <w:start w:val="1"/>
       <w:numFmt w:val="lowerLetter"/>
       <w:lvlText w:val="%1)"/>
@@ -5728,52 +5642,138 @@
         <w:ind w:left="1069" w:hanging="360"/>
       </w:pPr>
     </w:lvl>
-    <w:lvl w:ilvl="1" w:tplc="C45CA1DE">
+    <w:lvl w:ilvl="1" w:tplc="0250F9F0">
       <w:numFmt w:val="decimal"/>
       <w:lvlText w:val=""/>
       <w:lvlJc w:val="left"/>
     </w:lvl>
-    <w:lvl w:ilvl="2" w:tplc="2FB2142E">
+    <w:lvl w:ilvl="2" w:tplc="FDA8C36E">
       <w:numFmt w:val="decimal"/>
       <w:lvlText w:val=""/>
       <w:lvlJc w:val="left"/>
     </w:lvl>
-    <w:lvl w:ilvl="3" w:tplc="949A4F7C">
+    <w:lvl w:ilvl="3" w:tplc="DC38E9B4">
       <w:numFmt w:val="decimal"/>
       <w:lvlText w:val=""/>
       <w:lvlJc w:val="left"/>
     </w:lvl>
-    <w:lvl w:ilvl="4" w:tplc="CDC6C544">
+    <w:lvl w:ilvl="4" w:tplc="652842BC">
       <w:numFmt w:val="decimal"/>
       <w:lvlText w:val=""/>
       <w:lvlJc w:val="left"/>
     </w:lvl>
-    <w:lvl w:ilvl="5" w:tplc="44CE1936">
+    <w:lvl w:ilvl="5" w:tplc="96F80CEC">
       <w:numFmt w:val="decimal"/>
       <w:lvlText w:val=""/>
       <w:lvlJc w:val="left"/>
     </w:lvl>
-    <w:lvl w:ilvl="6" w:tplc="779AAE90">
+    <w:lvl w:ilvl="6" w:tplc="0E82ED48">
       <w:numFmt w:val="decimal"/>
       <w:lvlText w:val=""/>
       <w:lvlJc w:val="left"/>
     </w:lvl>
-    <w:lvl w:ilvl="7" w:tplc="3786A09C">
+    <w:lvl w:ilvl="7" w:tplc="A934B1E4">
       <w:numFmt w:val="decimal"/>
       <w:lvlText w:val=""/>
       <w:lvlJc w:val="left"/>
     </w:lvl>
-    <w:lvl w:ilvl="8" w:tplc="F21E070C">
+    <w:lvl w:ilvl="8" w:tplc="262A919C">
       <w:numFmt w:val="decimal"/>
       <w:lvlText w:val=""/>
       <w:lvlJc w:val="left"/>
     </w:lvl>
   </w:abstractNum>
+  <w:abstractNum w:abstractNumId="2" w15:restartNumberingAfterBreak="0">
+    <w:nsid w:val="62867CE9"/>
+    <w:multiLevelType w:val="hybridMultilevel"/>
+    <w:tmpl w:val="07C8E3AA"/>
+    <w:lvl w:ilvl="0" w:tplc="AB660D12" w:tentative="1">
+      <w:start w:val="1"/>
+      <w:numFmt w:val="bullet"/>
+      <w:lvlText w:val="●"/>
+      <w:lvlJc w:val="left"/>
+      <w:pPr>
+        <w:ind w:left="720" w:hanging="360"/>
+      </w:pPr>
+    </w:lvl>
+    <w:lvl w:ilvl="1" w:tplc="B1129A26" w:tentative="1">
+      <w:start w:val="1"/>
+      <w:numFmt w:val="bullet"/>
+      <w:lvlText w:val="○"/>
+      <w:lvlJc w:val="left"/>
+      <w:pPr>
+        <w:ind w:left="1440" w:hanging="360"/>
+      </w:pPr>
+    </w:lvl>
+    <w:lvl w:ilvl="2" w:tplc="31108D28" w:tentative="1">
+      <w:start w:val="1"/>
+      <w:numFmt w:val="bullet"/>
+      <w:lvlText w:val="■"/>
+      <w:lvlJc w:val="left"/>
+      <w:pPr>
+        <w:ind w:left="2160" w:hanging="360"/>
+      </w:pPr>
+    </w:lvl>
+    <w:lvl w:ilvl="3" w:tplc="B7F26BD4" w:tentative="1">
+      <w:start w:val="1"/>
+      <w:numFmt w:val="bullet"/>
+      <w:lvlText w:val="●"/>
+      <w:lvlJc w:val="left"/>
+      <w:pPr>
+        <w:ind w:left="2880" w:hanging="360"/>
+      </w:pPr>
+    </w:lvl>
+    <w:lvl w:ilvl="4" w:tplc="455651C8" w:tentative="1">
+      <w:start w:val="1"/>
+      <w:numFmt w:val="bullet"/>
+      <w:lvlText w:val="○"/>
+      <w:lvlJc w:val="left"/>
+      <w:pPr>
+        <w:ind w:left="3600" w:hanging="360"/>
+      </w:pPr>
+    </w:lvl>
+    <w:lvl w:ilvl="5" w:tplc="EB9C41E2" w:tentative="1">
+      <w:start w:val="1"/>
+      <w:numFmt w:val="bullet"/>
+      <w:lvlText w:val="■"/>
+      <w:lvlJc w:val="left"/>
+      <w:pPr>
+        <w:ind w:left="4320" w:hanging="360"/>
+      </w:pPr>
+    </w:lvl>
+    <w:lvl w:ilvl="6" w:tplc="07B4F5A0" w:tentative="1">
+      <w:start w:val="1"/>
+      <w:numFmt w:val="bullet"/>
+      <w:lvlText w:val="●"/>
+      <w:lvlJc w:val="left"/>
+      <w:pPr>
+        <w:ind w:left="5040" w:hanging="360"/>
+      </w:pPr>
+    </w:lvl>
+    <w:lvl w:ilvl="7" w:tplc="95E874B6" w:tentative="1">
+      <w:start w:val="1"/>
+      <w:numFmt w:val="bullet"/>
+      <w:lvlText w:val="●"/>
+      <w:lvlJc w:val="left"/>
+      <w:pPr>
+        <w:ind w:left="5760" w:hanging="360"/>
+      </w:pPr>
+    </w:lvl>
+    <w:lvl w:ilvl="8" w:tplc="D612E974" w:tentative="1">
+      <w:start w:val="1"/>
+      <w:numFmt w:val="bullet"/>
+      <w:lvlText w:val="●"/>
+      <w:lvlJc w:val="left"/>
+      <w:pPr>
+        <w:ind w:left="6480" w:hanging="360"/>
+      </w:pPr>
+    </w:lvl>
+  </w:abstractNum>
   <w:abstractNum w:abstractNumId="3" w15:restartNumberingAfterBreak="0">
-    <w:nsid w:val="44831783"/>
+    <w:nsid w:val="76EA4394"/>
     <w:multiLevelType w:val="hybridMultilevel"/>
-    <w:tmpl w:val="7E96A2A8"/>
-    <w:lvl w:ilvl="0" w:tplc="A0566AA4">
+    <w:tmpl w:val="B39008F8"/>
+    <w:lvl w:ilvl="0" w:tplc="86FE2FA2">
       <w:start w:val="1"/>
       <w:numFmt w:val="lowerLetter"/>
       <w:lvlText w:val="%1)"/>
@@ -5782,52 +5782,52 @@
         <w:ind w:left="1069" w:hanging="360"/>
       </w:pPr>
     </w:lvl>
-    <w:lvl w:ilvl="1" w:tplc="8A3A4692">
+    <w:lvl w:ilvl="1" w:tplc="DB166742">
       <w:numFmt w:val="decimal"/>
       <w:lvlText w:val=""/>
       <w:lvlJc w:val="left"/>
     </w:lvl>
-    <w:lvl w:ilvl="2" w:tplc="B802BA70">
+    <w:lvl w:ilvl="2" w:tplc="C0BA1A46">
       <w:numFmt w:val="decimal"/>
       <w:lvlText w:val=""/>
       <w:lvlJc w:val="left"/>
     </w:lvl>
-    <w:lvl w:ilvl="3" w:tplc="DE003D8C">
+    <w:lvl w:ilvl="3" w:tplc="53346130">
       <w:numFmt w:val="decimal"/>
       <w:lvlText w:val=""/>
       <w:lvlJc w:val="left"/>
     </w:lvl>
-    <w:lvl w:ilvl="4" w:tplc="8C84279C">
+    <w:lvl w:ilvl="4" w:tplc="C3CE2738">
       <w:numFmt w:val="decimal"/>
       <w:lvlText w:val=""/>
       <w:lvlJc w:val="left"/>
     </w:lvl>
-    <w:lvl w:ilvl="5" w:tplc="0AD8678E">
+    <w:lvl w:ilvl="5" w:tplc="0658DB10">
       <w:numFmt w:val="decimal"/>
       <w:lvlText w:val=""/>
       <w:lvlJc w:val="left"/>
     </w:lvl>
-    <w:lvl w:ilvl="6" w:tplc="3774A486">
+    <w:lvl w:ilvl="6" w:tplc="71B251AA">
       <w:numFmt w:val="decimal"/>
       <w:lvlText w:val=""/>
       <w:lvlJc w:val="left"/>
     </w:lvl>
-    <w:lvl w:ilvl="7" w:tplc="3DDA3FCE">
+    <w:lvl w:ilvl="7" w:tplc="41E69DAE">
       <w:numFmt w:val="decimal"/>
       <w:lvlText w:val=""/>
       <w:lvlJc w:val="left"/>
     </w:lvl>
-    <w:lvl w:ilvl="8" w:tplc="465A3E18">
+    <w:lvl w:ilvl="8" w:tplc="AC8E4112">
       <w:numFmt w:val="decimal"/>
       <w:lvlText w:val=""/>
       <w:lvlJc w:val="left"/>
     </w:lvl>
   </w:abstractNum>
   <w:abstractNum w:abstractNumId="4" w15:restartNumberingAfterBreak="0">
-    <w:nsid w:val="4FCD3C5A"/>
+    <w:nsid w:val="7D101F2F"/>
     <w:multiLevelType w:val="hybridMultilevel"/>
-    <w:tmpl w:val="FB9AE09E"/>
-    <w:lvl w:ilvl="0" w:tplc="9B464EBE">
+    <w:tmpl w:val="20B63052"/>
+    <w:lvl w:ilvl="0" w:tplc="28A23C9A">
       <w:start w:val="1"/>
       <w:numFmt w:val="lowerLetter"/>
       <w:lvlText w:val="%1)"/>
@@ -5836,72 +5836,72 @@
         <w:ind w:left="1069" w:hanging="360"/>
       </w:pPr>
     </w:lvl>
-    <w:lvl w:ilvl="1" w:tplc="1F5097DE">
+    <w:lvl w:ilvl="1" w:tplc="5F76A700">
       <w:numFmt w:val="decimal"/>
       <w:lvlText w:val=""/>
       <w:lvlJc w:val="left"/>
     </w:lvl>
-    <w:lvl w:ilvl="2" w:tplc="C478D344">
+    <w:lvl w:ilvl="2" w:tplc="424A917E">
       <w:numFmt w:val="decimal"/>
       <w:lvlText w:val=""/>
       <w:lvlJc w:val="left"/>
     </w:lvl>
-    <w:lvl w:ilvl="3" w:tplc="6B32B412">
+    <w:lvl w:ilvl="3" w:tplc="3C2A85E6">
       <w:numFmt w:val="decimal"/>
       <w:lvlText w:val=""/>
       <w:lvlJc w:val="left"/>
     </w:lvl>
-    <w:lvl w:ilvl="4" w:tplc="95A8E53E">
+    <w:lvl w:ilvl="4" w:tplc="4148C09E">
       <w:numFmt w:val="decimal"/>
       <w:lvlText w:val=""/>
       <w:lvlJc w:val="left"/>
     </w:lvl>
-    <w:lvl w:ilvl="5" w:tplc="3048C7DA">
+    <w:lvl w:ilvl="5" w:tplc="F27623E0">
       <w:numFmt w:val="decimal"/>
       <w:lvlText w:val=""/>
       <w:lvlJc w:val="left"/>
     </w:lvl>
-    <w:lvl w:ilvl="6" w:tplc="73C84D9E">
+    <w:lvl w:ilvl="6" w:tplc="96E2D13C">
       <w:numFmt w:val="decimal"/>
       <w:lvlText w:val=""/>
       <w:lvlJc w:val="left"/>
     </w:lvl>
-    <w:lvl w:ilvl="7" w:tplc="FB823666">
+    <w:lvl w:ilvl="7" w:tplc="7BD885AE">
       <w:numFmt w:val="decimal"/>
       <w:lvlText w:val=""/>
       <w:lvlJc w:val="left"/>
     </w:lvl>
-    <w:lvl w:ilvl="8" w:tplc="495CC410">
+    <w:lvl w:ilvl="8" w:tplc="C596BF8E">
       <w:numFmt w:val="decimal"/>
       <w:lvlText w:val=""/>
       <w:lvlJc w:val="left"/>
     </w:lvl>
   </w:abstractNum>
-  <w:num w:numId="1" w16cid:durableId="1280526749">
+  <w:num w:numId="1" w16cid:durableId="1940600044">
+    <w:abstractNumId w:val="2"/>
+    <w:lvlOverride w:ilvl="0">
+      <w:startOverride w:val="1"/>
+    </w:lvlOverride>
+  </w:num>
+  <w:num w:numId="2" w16cid:durableId="691226237">
+    <w:abstractNumId w:val="3"/>
+    <w:lvlOverride w:ilvl="0">
+      <w:startOverride w:val="1"/>
+    </w:lvlOverride>
+  </w:num>
+  <w:num w:numId="3" w16cid:durableId="218129459">
+    <w:abstractNumId w:val="0"/>
+    <w:lvlOverride w:ilvl="0">
+      <w:startOverride w:val="1"/>
+    </w:lvlOverride>
+  </w:num>
+  <w:num w:numId="4" w16cid:durableId="1853254495">
     <w:abstractNumId w:val="1"/>
     <w:lvlOverride w:ilvl="0">
       <w:startOverride w:val="1"/>
     </w:lvlOverride>
   </w:num>
-  <w:num w:numId="2" w16cid:durableId="1458641653">
-    <w:abstractNumId w:val="0"/>
-    <w:lvlOverride w:ilvl="0">
-      <w:startOverride w:val="1"/>
-    </w:lvlOverride>
-  </w:num>
-  <w:num w:numId="3" w16cid:durableId="776944554">
-    <w:abstractNumId w:val="2"/>
-    <w:lvlOverride w:ilvl="0">
-      <w:startOverride w:val="1"/>
-    </w:lvlOverride>
-  </w:num>
-  <w:num w:numId="4" w16cid:durableId="691146092">
-    <w:abstractNumId w:val="3"/>
-    <w:lvlOverride w:ilvl="0">
-      <w:startOverride w:val="1"/>
-    </w:lvlOverride>
-  </w:num>
-  <w:num w:numId="5" w16cid:durableId="2049715043">
+  <w:num w:numId="5" w16cid:durableId="862400669">
     <w:abstractNumId w:val="4"/>
     <w:lvlOverride w:ilvl="0">
       <w:startOverride w:val="1"/>

</xml_diff>